<commit_message>
Education: generic course reference instead of a course code
Co-Authored-By: Claude Opus 5.5 <noreply@anthropic.com>
Claude-Session: https://claude.ai/code/session_01A2TtsRJov8uxPoHCkXTh3x
</commit_message>
<xml_diff>
--- a/education/en/01_Instructor_Guide.docx
+++ b/education/en/01_Instructor_Guide.docx
@@ -157,23 +157,7 @@
         <w:pStyle w:val="BodyText"/>
       </w:pPr>
       <w:r>
-        <w:t xml:space="preserve">The package was built from the material that ships with CyberRiskGuardian (the method specifications, the governance textbook, the MediBec worked example and the desktop application’s teaching features) and from the author’s own course,</w:t>
-      </w:r>
-      <w:r>
-        <w:t xml:space="preserve"> </w:t>
-      </w:r>
-      <w:r>
-        <w:rPr>
-          <w:iCs/>
-          <w:i/>
-        </w:rPr>
-        <w:t xml:space="preserve">BTM 440 Business Information Systems Risks, Security and Audit</w:t>
-      </w:r>
-      <w:r>
-        <w:t xml:space="preserve"> </w:t>
-      </w:r>
-      <w:r>
-        <w:t xml:space="preserve">(Concordia University, Fall 2026), where CRG has been used for the team risk-assessment assignment.</w:t>
+        <w:t xml:space="preserve">The package was built from the material that ships with CyberRiskGuardian (the method specifications, the governance textbook, the MediBec worked example and the desktop application’s teaching features) and from the author’s own undergraduate course on information systems risks, security and audit, where CRG has been used for the team risk-assessment assignment.</w:t>
       </w:r>
     </w:p>
     <w:bookmarkStart w:id="20" w:name="what-is-in-the-package"/>
@@ -4382,7 +4366,7 @@
         <w:pStyle w:val="FirstParagraph"/>
       </w:pPr>
       <w:r>
-        <w:t xml:space="preserve">This is the model used in BTM 440. The risk assessment (A1) feeds the security policy (A2) and the audit plan (A3), so students follow one organization from risk to governance to assurance.</w:t>
+        <w:t xml:space="preserve">This is the model used in the author’s undergraduate course. The risk assessment (A1) feeds the security policy (A2) and the audit plan (A3), so students follow one organization from risk to governance to assurance.</w:t>
       </w:r>
     </w:p>
     <w:tbl>
@@ -5251,7 +5235,7 @@
         <w:pStyle w:val="BodyText"/>
       </w:pPr>
       <w:r>
-        <w:t xml:space="preserve">Suggested weights, as in BTM 440: A1 20% (team), A2 10% (team), A3 10% (individual), final exam 40% (including an essay on a business case), quizzes and labs 20%.</w:t>
+        <w:t xml:space="preserve">Suggested weights, as in the author’s undergraduate course: A1 20% (team), A2 10% (team), A3 10% (individual), final exam 40% (including an essay on a business case), quizzes and labs 20%.</w:t>
       </w:r>
     </w:p>
     <w:bookmarkEnd w:id="31"/>
@@ -6952,7 +6936,7 @@
         <w:pStyle w:val="FirstParagraph"/>
       </w:pPr>
       <w:r>
-        <w:t xml:space="preserve">CyberRiskGuardian is itself an AI-assisted tool, so the course must take a clear position on AI. The position below is the one used in BTM 440; adapt it to your institution’s policy.</w:t>
+        <w:t xml:space="preserve">CyberRiskGuardian is itself an AI-assisted tool, so the course must take a clear position on AI. The position below is the one used in the author’s undergraduate course; adapt it to your institution’s policy.</w:t>
       </w:r>
     </w:p>
     <w:p>

</xml_diff>